<commit_message>
style: update content of Michel's weekly report template document
</commit_message>
<xml_diff>
--- a/[Michel Template] [MBUA 532] Brief Weekly Report.docx
+++ b/[Michel Template] [MBUA 532] Brief Weekly Report.docx
@@ -138,7 +138,7 @@
       <w:pPr>
         <w:contextualSpacing w:val="0"/>
         <w:rPr>
-          <w:rFonts w:ascii="Times New Roman" w:hAnsi="Times New Roman" w:cs="Times New Roman" w:hint="eastAsia"/>
+          <w:rFonts w:ascii="Times New Roman" w:hAnsi="Times New Roman" w:cs="Times New Roman"/>
           <w:sz w:val="24"/>
           <w:szCs w:val="24"/>
           <w:lang w:eastAsia="ja-JP"/>
@@ -221,14 +221,14 @@
                 <w:rFonts w:ascii="Times New Roman" w:eastAsiaTheme="minorEastAsia" w:hAnsi="Times New Roman" w:cs="Times New Roman"/>
                 <w:lang w:val="en-US"/>
               </w:rPr>
-              <w:t>Team name:</w:t>
+              <w:t>Team name: BDO MBUA</w:t>
             </w:r>
           </w:p>
           <w:p>
             <w:pPr>
               <w:rPr>
-                <w:rFonts w:ascii="Times New Roman" w:eastAsiaTheme="minorEastAsia" w:hAnsi="Times New Roman" w:cs="Times New Roman"/>
-                <w:lang w:val="en-US"/>
+                <w:rFonts w:ascii="Times New Roman" w:hAnsi="Times New Roman" w:cs="Times New Roman" w:hint="eastAsia"/>
+                <w:lang w:val="en-US" w:eastAsia="ja-JP"/>
               </w:rPr>
             </w:pPr>
             <w:r>
@@ -236,7 +236,7 @@
                 <w:rFonts w:ascii="Times New Roman" w:eastAsiaTheme="minorEastAsia" w:hAnsi="Times New Roman" w:cs="Times New Roman"/>
                 <w:lang w:val="en-US"/>
               </w:rPr>
-              <w:t>Student name:</w:t>
+              <w:t>Student name: Ding, Sarala, Suhani, Taiki, Yusuf</w:t>
             </w:r>
           </w:p>
         </w:tc>
@@ -511,6 +511,7 @@
                 <w:lang w:val="en-US"/>
               </w:rPr>
             </w:pPr>
+            <w:proofErr w:type="gramStart"/>
             <w:r>
               <w:rPr>
                 <w:rFonts w:ascii="Times New Roman" w:eastAsiaTheme="minorEastAsia" w:hAnsi="Times New Roman" w:cs="Times New Roman"/>
@@ -529,6 +530,7 @@
               </w:rPr>
               <w:t>work</w:t>
             </w:r>
+            <w:proofErr w:type="gramEnd"/>
           </w:p>
         </w:tc>
         <w:tc>
@@ -2606,6 +2608,19 @@
 </file>
 
 <file path=customXml/item1.xml><?xml version="1.0" encoding="utf-8"?>
+<?mso-contentType ?>
+<FormTemplates xmlns="http://schemas.microsoft.com/sharepoint/v3/contenttype/forms">
+  <Display>DocumentLibraryForm</Display>
+  <Edit>DocumentLibraryForm</Edit>
+  <New>DocumentLibraryForm</New>
+</FormTemplates>
+</file>
+
+<file path=customXml/item2.xml><?xml version="1.0" encoding="utf-8"?>
+<b:Sources xmlns:b="http://schemas.openxmlformats.org/officeDocument/2006/bibliography" xmlns="http://schemas.openxmlformats.org/officeDocument/2006/bibliography" SelectedStyle="\APASixthEditionOfficeOnline.xsl" StyleName="APA" Version="6"/>
+</file>
+
+<file path=customXml/item3.xml><?xml version="1.0" encoding="utf-8"?>
 <ct:contentTypeSchema xmlns:ct="http://schemas.microsoft.com/office/2006/metadata/contentType" xmlns:ma="http://schemas.microsoft.com/office/2006/metadata/properties/metaAttributes" ct:_="" ma:_="" ma:contentTypeName="Document" ma:contentTypeID="0x01010067AFD7D639E1A14FBB537AD1C38F432A" ma:contentTypeVersion="11" ma:contentTypeDescription="Create a new document." ma:contentTypeScope="" ma:versionID="317e8ed8b152bfc51f61c6b114a7060c">
   <xsd:schema xmlns:xsd="http://www.w3.org/2001/XMLSchema" xmlns:xs="http://www.w3.org/2001/XMLSchema" xmlns:p="http://schemas.microsoft.com/office/2006/metadata/properties" xmlns:ns2="f5b85c5c-ce40-4213-8c3e-36e4bcfa1857" xmlns:ns3="727d1678-598c-44b6-9777-0e6f137b6df2" targetNamespace="http://schemas.microsoft.com/office/2006/metadata/properties" ma:root="true" ma:fieldsID="f751df2aa0af78f4687ca7b345abeb7a" ns2:_="" ns3:_="">
     <xsd:import namespace="f5b85c5c-ce40-4213-8c3e-36e4bcfa1857"/>
@@ -2800,19 +2815,6 @@
 </ct:contentTypeSchema>
 </file>
 
-<file path=customXml/item2.xml><?xml version="1.0" encoding="utf-8"?>
-<b:Sources xmlns:b="http://schemas.openxmlformats.org/officeDocument/2006/bibliography" xmlns="http://schemas.openxmlformats.org/officeDocument/2006/bibliography" SelectedStyle="\APASixthEditionOfficeOnline.xsl" StyleName="APA" Version="6"/>
-</file>
-
-<file path=customXml/item3.xml><?xml version="1.0" encoding="utf-8"?>
-<?mso-contentType ?>
-<FormTemplates xmlns="http://schemas.microsoft.com/sharepoint/v3/contenttype/forms">
-  <Display>DocumentLibraryForm</Display>
-  <Edit>DocumentLibraryForm</Edit>
-  <New>DocumentLibraryForm</New>
-</FormTemplates>
-</file>
-
 <file path=customXml/item4.xml><?xml version="1.0" encoding="utf-8"?>
 <p:properties xmlns:p="http://schemas.microsoft.com/office/2006/metadata/properties" xmlns:xsi="http://www.w3.org/2001/XMLSchema-instance" xmlns:pc="http://schemas.microsoft.com/office/infopath/2007/PartnerControls">
   <documentManagement>
@@ -2825,6 +2827,22 @@
 </file>
 
 <file path=customXml/itemProps1.xml><?xml version="1.0" encoding="utf-8"?>
+<ds:datastoreItem xmlns:ds="http://schemas.openxmlformats.org/officeDocument/2006/customXml" ds:itemID="{D664CCB3-B16B-4607-8BCE-8BDBADB1E853}">
+  <ds:schemaRefs>
+    <ds:schemaRef ds:uri="http://schemas.microsoft.com/sharepoint/v3/contenttype/forms"/>
+  </ds:schemaRefs>
+</ds:datastoreItem>
+</file>
+
+<file path=customXml/itemProps2.xml><?xml version="1.0" encoding="utf-8"?>
+<ds:datastoreItem xmlns:ds="http://schemas.openxmlformats.org/officeDocument/2006/customXml" ds:itemID="{97CF82F5-EA06-4012-A4D7-9EA3D55DCA75}">
+  <ds:schemaRefs>
+    <ds:schemaRef ds:uri="http://schemas.openxmlformats.org/officeDocument/2006/bibliography"/>
+  </ds:schemaRefs>
+</ds:datastoreItem>
+</file>
+
+<file path=customXml/itemProps3.xml><?xml version="1.0" encoding="utf-8"?>
 <ds:datastoreItem xmlns:ds="http://schemas.openxmlformats.org/officeDocument/2006/customXml" ds:itemID="{6C8850E4-9E23-4A2A-B8DE-118E4438CB29}">
   <ds:schemaRefs>
     <ds:schemaRef ds:uri="http://schemas.microsoft.com/office/2006/metadata/contentType"/>
@@ -2843,22 +2861,6 @@
 </ds:datastoreItem>
 </file>
 
-<file path=customXml/itemProps2.xml><?xml version="1.0" encoding="utf-8"?>
-<ds:datastoreItem xmlns:ds="http://schemas.openxmlformats.org/officeDocument/2006/customXml" ds:itemID="{97CF82F5-EA06-4012-A4D7-9EA3D55DCA75}">
-  <ds:schemaRefs>
-    <ds:schemaRef ds:uri="http://schemas.openxmlformats.org/officeDocument/2006/bibliography"/>
-  </ds:schemaRefs>
-</ds:datastoreItem>
-</file>
-
-<file path=customXml/itemProps3.xml><?xml version="1.0" encoding="utf-8"?>
-<ds:datastoreItem xmlns:ds="http://schemas.openxmlformats.org/officeDocument/2006/customXml" ds:itemID="{D664CCB3-B16B-4607-8BCE-8BDBADB1E853}">
-  <ds:schemaRefs>
-    <ds:schemaRef ds:uri="http://schemas.microsoft.com/sharepoint/v3/contenttype/forms"/>
-  </ds:schemaRefs>
-</ds:datastoreItem>
-</file>
-
 <file path=customXml/itemProps4.xml><?xml version="1.0" encoding="utf-8"?>
 <ds:datastoreItem xmlns:ds="http://schemas.openxmlformats.org/officeDocument/2006/customXml" ds:itemID="{E42C6263-92A2-4EAF-A5FA-9D13516EBA09}">
   <ds:schemaRefs>

</xml_diff>

<commit_message>
feat: update James and Michel report templates and view candidates
</commit_message>
<xml_diff>
--- a/[Michel Template] [MBUA 532] Brief Weekly Report.docx
+++ b/[Michel Template] [MBUA 532] Brief Weekly Report.docx
@@ -227,16 +227,56 @@
           <w:p>
             <w:pPr>
               <w:rPr>
+                <w:rFonts w:ascii="Times New Roman" w:hAnsi="Times New Roman" w:cs="Times New Roman"/>
+                <w:lang w:val="en-US" w:eastAsia="ja-JP"/>
+              </w:rPr>
+            </w:pPr>
+            <w:r>
+              <w:rPr>
+                <w:rFonts w:ascii="Times New Roman" w:eastAsiaTheme="minorEastAsia" w:hAnsi="Times New Roman" w:cs="Times New Roman"/>
+                <w:lang w:val="en-US"/>
+              </w:rPr>
+              <w:t>Student name: Ding, Sarala, Suhani, Taiki, Yusuf</w:t>
+            </w:r>
+          </w:p>
+          <w:p>
+            <w:pPr>
+              <w:rPr>
+                <w:rFonts w:ascii="Times New Roman" w:hAnsi="Times New Roman" w:cs="Times New Roman"/>
+                <w:lang w:val="en-US" w:eastAsia="ja-JP"/>
+              </w:rPr>
+            </w:pPr>
+            <w:r>
+              <w:rPr>
+                <w:rFonts w:ascii="Times New Roman" w:eastAsia="Times New Roman" w:hAnsi="Times New Roman" w:cs="Times New Roman"/>
+                <w:color w:val="000000" w:themeColor="text1"/>
+                <w:lang w:val="en-US"/>
+              </w:rPr>
+              <w:t>Duration:</w:t>
+            </w:r>
+            <w:r>
+              <w:rPr>
                 <w:rFonts w:ascii="Times New Roman" w:hAnsi="Times New Roman" w:cs="Times New Roman" w:hint="eastAsia"/>
+                <w:color w:val="000000" w:themeColor="text1"/>
                 <w:lang w:val="en-US" w:eastAsia="ja-JP"/>
               </w:rPr>
-            </w:pPr>
-            <w:r>
-              <w:rPr>
-                <w:rFonts w:ascii="Times New Roman" w:eastAsiaTheme="minorEastAsia" w:hAnsi="Times New Roman" w:cs="Times New Roman"/>
-                <w:lang w:val="en-US"/>
-              </w:rPr>
-              <w:t>Student name: Ding, Sarala, Suhani, Taiki, Yusuf</w:t>
+              <w:t xml:space="preserve"> 29 July </w:t>
+            </w:r>
+            <w:r>
+              <w:rPr>
+                <w:rFonts w:ascii="Times New Roman" w:hAnsi="Times New Roman" w:cs="Times New Roman"/>
+                <w:color w:val="000000" w:themeColor="text1"/>
+                <w:lang w:val="en-US" w:eastAsia="ja-JP"/>
+              </w:rPr>
+              <w:t>–</w:t>
+            </w:r>
+            <w:r>
+              <w:rPr>
+                <w:rFonts w:ascii="Times New Roman" w:hAnsi="Times New Roman" w:cs="Times New Roman" w:hint="eastAsia"/>
+                <w:color w:val="000000" w:themeColor="text1"/>
+                <w:lang w:val="en-US" w:eastAsia="ja-JP"/>
+              </w:rPr>
+              <w:t xml:space="preserve"> 4 August</w:t>
             </w:r>
           </w:p>
         </w:tc>
@@ -247,7 +287,91 @@
         <w:spacing w:line="360" w:lineRule="auto"/>
         <w:jc w:val="center"/>
         <w:rPr>
-          <w:rFonts w:ascii="Times New Roman" w:eastAsiaTheme="minorEastAsia" w:hAnsi="Times New Roman" w:cs="Times New Roman"/>
+          <w:rFonts w:ascii="Times New Roman" w:hAnsi="Times New Roman" w:cs="Times New Roman"/>
+          <w:lang w:eastAsia="ja-JP"/>
+        </w:rPr>
+      </w:pPr>
+    </w:p>
+    <w:tbl>
+      <w:tblPr>
+        <w:tblStyle w:val="TableGrid"/>
+        <w:tblW w:w="0" w:type="auto"/>
+        <w:tblLook w:val="04A0" w:firstRow="1" w:lastRow="0" w:firstColumn="1" w:lastColumn="0" w:noHBand="0" w:noVBand="1"/>
+      </w:tblPr>
+      <w:tblGrid>
+        <w:gridCol w:w="9067"/>
+      </w:tblGrid>
+      <w:tr>
+        <w:trPr>
+          <w:trHeight w:val="300"/>
+        </w:trPr>
+        <w:tc>
+          <w:tcPr>
+            <w:tcW w:w="9067" w:type="dxa"/>
+            <w:shd w:val="clear" w:color="auto" w:fill="92CDDC" w:themeFill="accent5" w:themeFillTint="99"/>
+          </w:tcPr>
+          <w:p>
+            <w:pPr>
+              <w:rPr>
+                <w:rFonts w:ascii="Times New Roman" w:hAnsi="Times New Roman" w:cs="Times New Roman" w:hint="eastAsia"/>
+                <w:b/>
+                <w:bCs/>
+                <w:sz w:val="28"/>
+                <w:szCs w:val="28"/>
+                <w:lang w:val="en-US" w:eastAsia="ja-JP"/>
+              </w:rPr>
+            </w:pPr>
+            <w:r>
+              <w:rPr>
+                <w:rFonts w:ascii="Times New Roman" w:eastAsiaTheme="minorEastAsia" w:hAnsi="Times New Roman" w:cs="Times New Roman"/>
+                <w:b/>
+                <w:bCs/>
+                <w:sz w:val="28"/>
+                <w:szCs w:val="28"/>
+                <w:lang w:val="en-US"/>
+              </w:rPr>
+              <w:t xml:space="preserve">Weekly </w:t>
+            </w:r>
+            <w:r>
+              <w:rPr>
+                <w:rFonts w:ascii="Times New Roman" w:hAnsi="Times New Roman" w:cs="Times New Roman" w:hint="eastAsia"/>
+                <w:b/>
+                <w:bCs/>
+                <w:sz w:val="28"/>
+                <w:szCs w:val="28"/>
+                <w:lang w:val="en-US" w:eastAsia="ja-JP"/>
+              </w:rPr>
+              <w:t>Summary</w:t>
+            </w:r>
+          </w:p>
+        </w:tc>
+      </w:tr>
+      <w:tr>
+        <w:trPr>
+          <w:trHeight w:val="405"/>
+        </w:trPr>
+        <w:tc>
+          <w:tcPr>
+            <w:tcW w:w="9067" w:type="dxa"/>
+          </w:tcPr>
+          <w:p>
+            <w:pPr>
+              <w:rPr>
+                <w:rFonts w:ascii="Times New Roman" w:hAnsi="Times New Roman" w:cs="Times New Roman" w:hint="eastAsia"/>
+                <w:lang w:val="en-US" w:eastAsia="ja-JP"/>
+              </w:rPr>
+            </w:pPr>
+          </w:p>
+        </w:tc>
+      </w:tr>
+    </w:tbl>
+    <w:p>
+      <w:pPr>
+        <w:spacing w:line="360" w:lineRule="auto"/>
+        <w:jc w:val="center"/>
+        <w:rPr>
+          <w:rFonts w:ascii="Times New Roman" w:hAnsi="Times New Roman" w:cs="Times New Roman" w:hint="eastAsia"/>
+          <w:lang w:eastAsia="ja-JP"/>
         </w:rPr>
       </w:pPr>
     </w:p>
@@ -2608,6 +2732,10 @@
 </file>
 
 <file path=customXml/item1.xml><?xml version="1.0" encoding="utf-8"?>
+<b:Sources xmlns:b="http://schemas.openxmlformats.org/officeDocument/2006/bibliography" xmlns="http://schemas.openxmlformats.org/officeDocument/2006/bibliography" SelectedStyle="\APASixthEditionOfficeOnline.xsl" StyleName="APA" Version="6"/>
+</file>
+
+<file path=customXml/item2.xml><?xml version="1.0" encoding="utf-8"?>
 <?mso-contentType ?>
 <FormTemplates xmlns="http://schemas.microsoft.com/sharepoint/v3/contenttype/forms">
   <Display>DocumentLibraryForm</Display>
@@ -2616,11 +2744,18 @@
 </FormTemplates>
 </file>
 
-<file path=customXml/item2.xml><?xml version="1.0" encoding="utf-8"?>
-<b:Sources xmlns:b="http://schemas.openxmlformats.org/officeDocument/2006/bibliography" xmlns="http://schemas.openxmlformats.org/officeDocument/2006/bibliography" SelectedStyle="\APASixthEditionOfficeOnline.xsl" StyleName="APA" Version="6"/>
+<file path=customXml/item3.xml><?xml version="1.0" encoding="utf-8"?>
+<p:properties xmlns:p="http://schemas.microsoft.com/office/2006/metadata/properties" xmlns:xsi="http://www.w3.org/2001/XMLSchema-instance" xmlns:pc="http://schemas.microsoft.com/office/infopath/2007/PartnerControls">
+  <documentManagement>
+    <lcf76f155ced4ddcb4097134ff3c332f xmlns="f5b85c5c-ce40-4213-8c3e-36e4bcfa1857">
+      <Terms xmlns="http://schemas.microsoft.com/office/infopath/2007/PartnerControls"/>
+    </lcf76f155ced4ddcb4097134ff3c332f>
+    <TaxCatchAll xmlns="727d1678-598c-44b6-9777-0e6f137b6df2" xsi:nil="true"/>
+  </documentManagement>
+</p:properties>
 </file>
 
-<file path=customXml/item3.xml><?xml version="1.0" encoding="utf-8"?>
+<file path=customXml/item4.xml><?xml version="1.0" encoding="utf-8"?>
 <ct:contentTypeSchema xmlns:ct="http://schemas.microsoft.com/office/2006/metadata/contentType" xmlns:ma="http://schemas.microsoft.com/office/2006/metadata/properties/metaAttributes" ct:_="" ma:_="" ma:contentTypeName="Document" ma:contentTypeID="0x01010067AFD7D639E1A14FBB537AD1C38F432A" ma:contentTypeVersion="11" ma:contentTypeDescription="Create a new document." ma:contentTypeScope="" ma:versionID="317e8ed8b152bfc51f61c6b114a7060c">
   <xsd:schema xmlns:xsd="http://www.w3.org/2001/XMLSchema" xmlns:xs="http://www.w3.org/2001/XMLSchema" xmlns:p="http://schemas.microsoft.com/office/2006/metadata/properties" xmlns:ns2="f5b85c5c-ce40-4213-8c3e-36e4bcfa1857" xmlns:ns3="727d1678-598c-44b6-9777-0e6f137b6df2" targetNamespace="http://schemas.microsoft.com/office/2006/metadata/properties" ma:root="true" ma:fieldsID="f751df2aa0af78f4687ca7b345abeb7a" ns2:_="" ns3:_="">
     <xsd:import namespace="f5b85c5c-ce40-4213-8c3e-36e4bcfa1857"/>
@@ -2815,18 +2950,15 @@
 </ct:contentTypeSchema>
 </file>
 
-<file path=customXml/item4.xml><?xml version="1.0" encoding="utf-8"?>
-<p:properties xmlns:p="http://schemas.microsoft.com/office/2006/metadata/properties" xmlns:xsi="http://www.w3.org/2001/XMLSchema-instance" xmlns:pc="http://schemas.microsoft.com/office/infopath/2007/PartnerControls">
-  <documentManagement>
-    <lcf76f155ced4ddcb4097134ff3c332f xmlns="f5b85c5c-ce40-4213-8c3e-36e4bcfa1857">
-      <Terms xmlns="http://schemas.microsoft.com/office/infopath/2007/PartnerControls"/>
-    </lcf76f155ced4ddcb4097134ff3c332f>
-    <TaxCatchAll xmlns="727d1678-598c-44b6-9777-0e6f137b6df2" xsi:nil="true"/>
-  </documentManagement>
-</p:properties>
+<file path=customXml/itemProps1.xml><?xml version="1.0" encoding="utf-8"?>
+<ds:datastoreItem xmlns:ds="http://schemas.openxmlformats.org/officeDocument/2006/customXml" ds:itemID="{97CF82F5-EA06-4012-A4D7-9EA3D55DCA75}">
+  <ds:schemaRefs>
+    <ds:schemaRef ds:uri="http://schemas.openxmlformats.org/officeDocument/2006/bibliography"/>
+  </ds:schemaRefs>
+</ds:datastoreItem>
 </file>
 
-<file path=customXml/itemProps1.xml><?xml version="1.0" encoding="utf-8"?>
+<file path=customXml/itemProps2.xml><?xml version="1.0" encoding="utf-8"?>
 <ds:datastoreItem xmlns:ds="http://schemas.openxmlformats.org/officeDocument/2006/customXml" ds:itemID="{D664CCB3-B16B-4607-8BCE-8BDBADB1E853}">
   <ds:schemaRefs>
     <ds:schemaRef ds:uri="http://schemas.microsoft.com/sharepoint/v3/contenttype/forms"/>
@@ -2834,15 +2966,18 @@
 </ds:datastoreItem>
 </file>
 
-<file path=customXml/itemProps2.xml><?xml version="1.0" encoding="utf-8"?>
-<ds:datastoreItem xmlns:ds="http://schemas.openxmlformats.org/officeDocument/2006/customXml" ds:itemID="{97CF82F5-EA06-4012-A4D7-9EA3D55DCA75}">
+<file path=customXml/itemProps3.xml><?xml version="1.0" encoding="utf-8"?>
+<ds:datastoreItem xmlns:ds="http://schemas.openxmlformats.org/officeDocument/2006/customXml" ds:itemID="{E42C6263-92A2-4EAF-A5FA-9D13516EBA09}">
   <ds:schemaRefs>
-    <ds:schemaRef ds:uri="http://schemas.openxmlformats.org/officeDocument/2006/bibliography"/>
+    <ds:schemaRef ds:uri="http://schemas.microsoft.com/office/2006/metadata/properties"/>
+    <ds:schemaRef ds:uri="http://schemas.microsoft.com/office/infopath/2007/PartnerControls"/>
+    <ds:schemaRef ds:uri="f5b85c5c-ce40-4213-8c3e-36e4bcfa1857"/>
+    <ds:schemaRef ds:uri="727d1678-598c-44b6-9777-0e6f137b6df2"/>
   </ds:schemaRefs>
 </ds:datastoreItem>
 </file>
 
-<file path=customXml/itemProps3.xml><?xml version="1.0" encoding="utf-8"?>
+<file path=customXml/itemProps4.xml><?xml version="1.0" encoding="utf-8"?>
 <ds:datastoreItem xmlns:ds="http://schemas.openxmlformats.org/officeDocument/2006/customXml" ds:itemID="{6C8850E4-9E23-4A2A-B8DE-118E4438CB29}">
   <ds:schemaRefs>
     <ds:schemaRef ds:uri="http://schemas.microsoft.com/office/2006/metadata/contentType"/>
@@ -2859,15 +2994,4 @@
     <ds:schemaRef ds:uri="http://schemas.microsoft.com/internal/obd"/>
   </ds:schemaRefs>
 </ds:datastoreItem>
-</file>
-
-<file path=customXml/itemProps4.xml><?xml version="1.0" encoding="utf-8"?>
-<ds:datastoreItem xmlns:ds="http://schemas.openxmlformats.org/officeDocument/2006/customXml" ds:itemID="{E42C6263-92A2-4EAF-A5FA-9D13516EBA09}">
-  <ds:schemaRefs>
-    <ds:schemaRef ds:uri="http://schemas.microsoft.com/office/2006/metadata/properties"/>
-    <ds:schemaRef ds:uri="http://schemas.microsoft.com/office/infopath/2007/PartnerControls"/>
-    <ds:schemaRef ds:uri="f5b85c5c-ce40-4213-8c3e-36e4bcfa1857"/>
-    <ds:schemaRef ds:uri="727d1678-598c-44b6-9777-0e6f137b6df2"/>
-  </ds:schemaRefs>
-</ds:datastoreItem>
 </file>
</xml_diff>